<commit_message>
Auto sync: Dữ liệu Cập nhật Phân tích & Giao diện (H1) mới
</commit_message>
<xml_diff>
--- a/Daily Reports/01_10_2026-CBOT Reports.docx
+++ b/Daily Reports/01_10_2026-CBOT Reports.docx
@@ -104,7 +104,7 @@
           <w:color w:val="5C768D"/>
           <w:sz w:val="19"/>
         </w:rPr>
-        <w:t>Cập nhật tự động qua `macro_tracker.py` vào lúc 06:55 ICT ngày 01/10/2026</w:t>
+        <w:t>Cập nhật tự động qua `macro_tracker.py` vào lúc 07:01 ICT ngày 01/10/2026</w:t>
       </w:r>
     </w:p>
     <w:tbl>
@@ -313,7 +313,7 @@
               <w:rPr>
                 <w:b/>
               </w:rPr>
-              <w:t>97.59 / thùng</w:t>
+              <w:t>97.54 / thùng</w:t>
             </w:r>
           </w:p>
         </w:tc>
@@ -344,7 +344,7 @@
               <w:rPr>
                 <w:b/>
               </w:rPr>
-              <w:t>-4.87%</w:t>
+              <w:t>-4.92%</w:t>
             </w:r>
           </w:p>
         </w:tc>
@@ -473,7 +473,7 @@
               <w:rPr>
                 <w:b/>
               </w:rPr>
-              <w:t>+0.09%</w:t>
+              <w:t>+0.10%</w:t>
             </w:r>
           </w:p>
         </w:tc>
@@ -1218,7 +1218,7 @@
         <w:rPr>
           <w:b/>
         </w:rPr>
-        <w:t>`97.59` (-4.87%)</w:t>
+        <w:t>`97.54` (-4.92%)</w:t>
       </w:r>
       <w:r>
         <w:t xml:space="preserve"> | DXY: </w:t>
@@ -1227,7 +1227,7 @@
         <w:rPr>
           <w:b/>
         </w:rPr>
-        <w:t>`101.47` (+0.09%)</w:t>
+        <w:t>`101.47` (+0.10%)</w:t>
       </w:r>
       <w:r>
         <w:t xml:space="preserve"> | Lúa mì CBOT: </w:t>
@@ -1350,7 +1350,7 @@
           <w:color w:val="5C768D"/>
           <w:sz w:val="19"/>
         </w:rPr>
-        <w:t>Cập nhật tự động lúc 06:55 ICT ngày 01/10/2026 — Nguồn: NOAA, USDA, BOM Australia</w:t>
+        <w:t>Cập nhật tự động lúc 07:01 ICT ngày 01/10/2026 — Nguồn: NOAA, USDA, BOM Australia</w:t>
       </w:r>
     </w:p>
     <w:p>
@@ -3649,7 +3649,7 @@
               <w:rPr>
                 <w:b/>
               </w:rPr>
-              <w:t>508.50 (+7.25)</w:t>
+              <w:t>508.48 (+7.23)</w:t>
             </w:r>
           </w:p>
         </w:tc>
@@ -11668,10 +11668,10 @@
         <w:rPr>
           <w:b/>
         </w:rPr>
-        <w:t>`508.50 cents`</w:t>
+        <w:t>`508.48 cents`</w:t>
       </w:r>
       <w:r>
-        <w:t xml:space="preserve"> (+7.25).</w:t>
+        <w:t xml:space="preserve"> (+7.23).</w:t>
       </w:r>
     </w:p>
     <w:p>
@@ -12035,7 +12035,7 @@
               <w:rPr>
                 <w:b/>
               </w:rPr>
-              <w:t>97.59</w:t>
+              <w:t>97.54</w:t>
             </w:r>
           </w:p>
         </w:tc>
@@ -12066,7 +12066,7 @@
               <w:rPr>
                 <w:b/>
               </w:rPr>
-              <w:t>-4.87%</w:t>
+              <w:t>-4.92%</w:t>
             </w:r>
           </w:p>
         </w:tc>
@@ -12189,7 +12189,7 @@
               <w:rPr>
                 <w:b/>
               </w:rPr>
-              <w:t>+0.09%</w:t>
+              <w:t>+0.10%</w:t>
             </w:r>
           </w:p>
         </w:tc>
@@ -22217,7 +22217,7 @@
               <w:rPr>
                 <w:b/>
               </w:rPr>
-              <w:t>97.59</w:t>
+              <w:t>97.54</w:t>
             </w:r>
           </w:p>
         </w:tc>
@@ -22248,7 +22248,7 @@
               <w:rPr>
                 <w:b/>
               </w:rPr>
-              <w:t>-4.87%</w:t>
+              <w:t>-4.92%</w:t>
             </w:r>
           </w:p>
         </w:tc>
@@ -22371,7 +22371,7 @@
               <w:rPr>
                 <w:b/>
               </w:rPr>
-              <w:t>+0.09%</w:t>
+              <w:t>+0.10%</w:t>
             </w:r>
           </w:p>
         </w:tc>

</xml_diff>